<commit_message>
Servicios Empresariales: align offering names and values with solution cards
Co-Authored-By: Claude Opus 5.5 <noreply@anthropic.com>
Claude-Session: https://claude.ai/code/session_01MDdXgMpX7i1guBDSiddehG
</commit_message>
<xml_diff>
--- a/consein-soluciones/Consein_Palabras_Clave_SEO_Soluciones.docx
+++ b/consein-soluciones/Consein_Palabras_Clave_SEO_Soluciones.docx
@@ -15836,7 +15836,7 @@
                 <w:sz w:val="19"/>
                 <w:szCs w:val="19"/>
               </w:rPr>
-              <w:t xml:space="preserve">Business Central Quick Start</w:t>
+              <w:t xml:space="preserve">Implementación de Business Central</w:t>
             </w:r>
           </w:p>
         </w:tc>
@@ -15924,7 +15924,7 @@
                 <w:sz w:val="19"/>
                 <w:szCs w:val="19"/>
               </w:rPr>
-              <w:t xml:space="preserve">Ruta Great Plains a Business Central</w:t>
+              <w:t xml:space="preserve">De Dynamics GP a Business Central</w:t>
             </w:r>
           </w:p>
         </w:tc>
@@ -16011,7 +16011,7 @@
                 <w:sz w:val="19"/>
                 <w:szCs w:val="19"/>
               </w:rPr>
-              <w:t xml:space="preserve">CRM de Ventas y Servicio al Cliente</w:t>
+              <w:t xml:space="preserve">CRM comercial y de servicio</w:t>
             </w:r>
           </w:p>
         </w:tc>
@@ -16099,7 +16099,7 @@
                 <w:sz w:val="19"/>
                 <w:szCs w:val="19"/>
               </w:rPr>
-              <w:t xml:space="preserve">Tablero Ejecutivo Power BI</w:t>
+              <w:t xml:space="preserve">Power BI para la dirección</w:t>
             </w:r>
           </w:p>
         </w:tc>
@@ -16186,7 +16186,7 @@
                 <w:sz w:val="19"/>
                 <w:szCs w:val="19"/>
               </w:rPr>
-              <w:t xml:space="preserve">Copilot para Finanzas y Ventas</w:t>
+              <w:t xml:space="preserve">Copilot para finanzas y ventas</w:t>
             </w:r>
           </w:p>
         </w:tc>
@@ -16274,7 +16274,7 @@
                 <w:sz w:val="19"/>
                 <w:szCs w:val="19"/>
               </w:rPr>
-              <w:t xml:space="preserve">Soporte y Evolución de Dynamics</w:t>
+              <w:t xml:space="preserve">Soporte y evolución de Dynamics 365</w:t>
             </w:r>
           </w:p>
         </w:tc>

</xml_diff>